<commit_message>
docs(review): re-verify P8 live + cross-paper headline-number provenance audit
- Re-ran official P8 7-Pacific replication; M1 b=-1.339/N=209,
  full sample N=959/13.8% exporters reproduce exactly from built CSV
- Documented R-vs-Python bivariate spec difference (-0.864 vs -0.919),
  manuscript uses R canonical; FIP conclusion unchanged
- Verified P3/P4/P5/P7/P9 headline turning points trace to committed
  canonical results files (no fabrication)
- Regenerated 2 stale docx (P4 title page, P9 MIR cover letter)
- Added CROSS_PAPER_NUMBER_VERIFICATION ledger; updated provenance ledger
</commit_message>
<xml_diff>
--- a/p9_india/submission/mir_package/03_cover_letter.docx
+++ b/p9_india/submission/mir_package/03_cover_letter.docx
@@ -50,7 +50,35 @@
           <w:bCs/>
           <w:b/>
         </w:rPr>
-        <w:t xml:space="preserve">Submission of Manuscript: "When Institutional Transformation Breaks the Threshold: The Disappearance of the Inverted-U Internationalisation–Performance Relationship in Indian Firms, 2014–2025"</w:t>
+        <w:t xml:space="preserve">Submission of Manuscript:</w:t>
+      </w:r>
+      <w:r>
+        <w:rPr>
+          <w:bCs/>
+          <w:b/>
+        </w:rPr>
+        <w:t xml:space="preserve"> </w:t>
+      </w:r>
+      <w:r>
+        <w:rPr>
+          <w:bCs/>
+          <w:b/>
+        </w:rPr>
+        <w:t xml:space="preserve">“</w:t>
+      </w:r>
+      <w:r>
+        <w:rPr>
+          <w:bCs/>
+          <w:b/>
+        </w:rPr>
+        <w:t xml:space="preserve">When Institutional Transformation Breaks the Threshold: The Disappearance of the Inverted-U Internationalisation–Performance Relationship in Indian Firms, 2014–2025</w:t>
+      </w:r>
+      <w:r>
+        <w:rPr>
+          <w:bCs/>
+          <w:b/>
+        </w:rPr>
+        <w:t xml:space="preserve">”</w:t>
       </w:r>
     </w:p>
     <w:p>
@@ -79,7 +107,7 @@
         <w:t xml:space="preserve">Management International Review</w:t>
       </w:r>
       <w:r>
-        <w:t xml:space="preserve">. The paper presents an empirical study of the internationalisation–performance (I-P) threshold using three waves of World Bank Enterprise Survey microdata for India (2014 PICS3, N = 9,281; 2022 BEE, N = 9,376; 2025 BREADY, N = 10,479; pooled raw N = 29,136). The 2014–2025 window spans India's exceptional institutional and digital transformation decade: demonetisation 2016, Goods and Services Tax 2017, Insolvency and Bankruptcy Code 2016, Unified Payments Interface (UPI) launch 2016 and saturation 2024, Production-Linked Incentive scheme 2020, COVID-19 2020-2022, and Atmanirbhar Bharat self-reliance policy 2020.</w:t>
+        <w:t xml:space="preserve">. The paper presents an empirical study of the internationalisation–performance (I-P) threshold using three waves of World Bank Enterprise Survey microdata for India (2014 PICS3, N = 9,281; 2022 BEE, N = 9,376; 2025 BREADY, N = 10,479; pooled raw N = 29,136). The 2014–2025 window spans India’s exceptional institutional and digital transformation decade: demonetisation 2016, Goods and Services Tax 2017, Insolvency and Bankruptcy Code 2016, Unified Payments Interface (UPI) launch 2016 and saturation 2024, Production-Linked Incentive scheme 2020, COVID-19 2020-2022, and Atmanirbhar Bharat self-reliance policy 2020.</w:t>
       </w:r>
     </w:p>
     <w:p>
@@ -112,7 +140,7 @@
         <w:t xml:space="preserve">core international business question</w:t>
       </w:r>
       <w:r>
-        <w:t xml:space="preserve">, the durability of the internationalisation–performance relationship under institutional change, using a large, multi-wave emerging-market dataset, consistent with MIR's editorial focus on rigorous comparative empirical research. Second, the</w:t>
+        <w:t xml:space="preserve">, the durability of the internationalisation–performance relationship under institutional change, using a large, multi-wave emerging-market dataset, consistent with MIR’s editorial focus on rigorous comparative empirical research. Second, the</w:t>
       </w:r>
       <w:r>
         <w:t xml:space="preserve"> </w:t>
@@ -222,7 +250,7 @@
         <w:pStyle w:val="BodyText"/>
       </w:pPr>
       <w:r>
-        <w:t xml:space="preserve">Third, the manuscript</w:t>
+        <w:t xml:space="preserve">Third, the manuscript tests whether the threshold stability documented in less turbulent emerging-market settings extends to India, and finds that</w:t>
       </w:r>
       <w:r>
         <w:t xml:space="preserve"> </w:t>
@@ -232,13 +260,23 @@
           <w:bCs/>
           <w:b/>
         </w:rPr>
-        <w:t xml:space="preserve">replicates and extends</w:t>
-      </w:r>
-      <w:r>
-        <w:t xml:space="preserve"> </w:t>
-      </w:r>
-      <w:r>
-        <w:t xml:space="preserve">the threshold-durability finding documented for China (Author Citation P5, under review at IJOEM, 2026) and Vietnam (Author Citation P3, under review at JED, 2026) to the South Asian context. If India also exhibits durability under far more severe institutional change, the structural-durability claim gains substantial external validity.</w:t>
+        <w:t xml:space="preserve">it does not</w:t>
+      </w:r>
+      <w:r>
+        <w:t xml:space="preserve">: under India’s far more severe institutional transformation the inverted-U threshold</w:t>
+      </w:r>
+      <w:r>
+        <w:t xml:space="preserve"> </w:t>
+      </w:r>
+      <w:r>
+        <w:rPr>
+          <w:bCs/>
+          <w:b/>
+        </w:rPr>
+        <w:t xml:space="preserve">dissolves rather than relocates</w:t>
+      </w:r>
+      <w:r>
+        <w:t xml:space="preserve">. This identifies an environmental scope condition, institutional stability, for the canonical inverted-U claim, a boundary that the cross-country literature has assumed but never tested with multi-wave firm-level data. Companion single-country analyses by the authors (Vietnam and China) are in preparation.</w:t>
       </w:r>
     </w:p>
     <w:p>
@@ -285,7 +323,7 @@
     <w:tbl>
       <w:tblPr>
         <w:tblStyle w:val="Table"/>
-        <w:tblW w:type="auto" w:w="0"/>
+        <w:tblW w:type="pct" w:w="5000"/>
         <w:tblLook w:firstRow="1" w:lastRow="0" w:firstColumn="0" w:lastColumn="0" w:noHBand="0" w:noVBand="0" w:val="0020"/>
         <w:jc w:val="start"/>
       </w:tblPr>
@@ -558,7 +596,7 @@
               <w:jc w:val="left"/>
             </w:pPr>
             <w:r>
-              <w:t xml:space="preserve">Up to ~22,000 obs (full WBES, 3 waves)</w:t>
+              <w:t xml:space="preserve">28,717 analytic obs (full WBES, 3 waves)</w:t>
             </w:r>
           </w:p>
         </w:tc>
@@ -627,7 +665,7 @@
         <w:pStyle w:val="BodyText"/>
       </w:pPr>
       <w:r>
-        <w:t xml:space="preserve">This manuscript is original, has not been published previously, and is not under consideration elsewhere. All authors approve the submission. The authors declare no conflict of interest. No specific grant from any funding agency was received. The use of WBES data is subject to the World Bank's standard data agreement.</w:t>
+        <w:t xml:space="preserve">This manuscript is original, has not been published previously, and is not under consideration elsewhere. All authors approve the submission. The authors declare no conflict of interest. No specific grant from any funding agency was received. The use of WBES data is subject to the World Bank’s standard data agreement.</w:t>
       </w:r>
     </w:p>
     <w:p>
@@ -707,7 +745,7 @@
         <w:pStyle w:val="FirstParagraph"/>
       </w:pPr>
       <w:r>
-        <w:t xml:space="preserve">We hope the manuscript will be of interest to MIR's readership and look forward to the review process.</w:t>
+        <w:t xml:space="preserve">We hope the manuscript will be of interest to MIR’s readership and look forward to the review process.</w:t>
       </w:r>
     </w:p>
     <w:p>
@@ -745,24 +783,7 @@
         <w:t xml:space="preserve"> </w:t>
       </w:r>
       <w:r>
-        <w:t xml:space="preserve">Email:</w:t>
-      </w:r>
-      <w:r>
-        <w:t xml:space="preserve"> </w:t>
-      </w:r>
-      <w:hyperlink r:id="rId20">
-        <w:r>
-          <w:rPr>
-            <w:rStyle w:val="Hyperlink"/>
-          </w:rPr>
-          <w:t xml:space="preserve">thuyhuongctu@gmail.com</w:t>
-        </w:r>
-      </w:hyperlink>
-      <w:r>
-        <w:t xml:space="preserve"> </w:t>
-      </w:r>
-      <w:r>
-        <w:t xml:space="preserve">| ORCID: 0000-0002-7711-2487</w:t>
+        <w:t xml:space="preserve">Email: thuyhuongctu@gmail.com | ORCID: 0000-0002-7711-2487</w:t>
       </w:r>
     </w:p>
     <w:p>
@@ -802,24 +823,7 @@
         <w:t xml:space="preserve"> </w:t>
       </w:r>
       <w:r>
-        <w:t xml:space="preserve">Email:</w:t>
-      </w:r>
-      <w:r>
-        <w:t xml:space="preserve"> </w:t>
-      </w:r>
-      <w:hyperlink r:id="rId21">
-        <w:r>
-          <w:rPr>
-            <w:rStyle w:val="Hyperlink"/>
-          </w:rPr>
-          <w:t xml:space="preserve">patu@ctu.edu.vn</w:t>
-        </w:r>
-      </w:hyperlink>
-      <w:r>
-        <w:t xml:space="preserve"> </w:t>
-      </w:r>
-      <w:r>
-        <w:t xml:space="preserve">| ORCID: 0000-0003-0667-3137</w:t>
+        <w:t xml:space="preserve">Email: patu@ctu.edu.vn | ORCID: 0000-0003-0667-3137</w:t>
       </w:r>
     </w:p>
     <w:sectPr/>

</xml_diff>